<commit_message>
Doc 62 (UST-27) v3: tras tres revisiones independientes — Entrega A as-built, D7 con Pitch y /hub, D15 pase directo en dos pasos
Solo _integration/docs (html, docx, PDF, .sha256); sale al hub con el siguiente Deploy Web (po269), junto con la firma.

Co-Authored-By: Claude Fable 5.1 <noreply@anthropic.com>
</commit_message>
<xml_diff>
--- a/_integration/docs/ust/UST-2026-09-30-27-tres-llaves-hub-admin-salas.docx
+++ b/_integration/docs/ust/UST-2026-09-30-27-tres-llaves-hub-admin-salas.docx
@@ -63,7 +63,7 @@
           <w:sz w:val="20"/>
           <w:szCs w:val="20"/>
         </w:rPr>
-        <w:t xml:space="preserve">PROPUESTA (30-sep-2026, madrugada) · Entrega A (cerrar el desbloqueo por longitud de Design) lista para desplegar en cuanto Juanjo diga D1 · Entrega B (tres llaves, 24 h, una sesión) se construye tras la validación fila a fila de D1–D14. Antes que nada: D13 — comprobar en Cloudflare la política Include y los Logs de Access.</w:t>
+        <w:t xml:space="preserve">PROPUESTA v3 (30-sep-2026, madrugada; revisada por tres lentes independientes — seguridad, usabilidad de las founders, viabilidad contra el código — antes de entregarla) · Entrega A DESPLEGADA por Juanjo a las 00:25 (po268, ns-build 3009-001913, webdeploy c307745 + 47412f5): en vivo, /v1/ sirve 0 apariciones de «hubCode.length === 6) {» y 1 de «if (false) {», cortinilla y RPC intactas, /hub sigue tras Access, smoke-prod verde con el check nuevo (D1 resuelta por el hecho) · Entrega B (tres llaves, 24 h, una sesión por superficie) se construye tras la validación fila a fila de D2–D15. Antes que nada: D13 — comprobar en Cloudflare la política Include y los Logs de Access.</w:t>
       </w:r>
     </w:p>
     <w:p>
@@ -511,7 +511,7 @@
                 <w:sz w:val="16"/>
                 <w:szCs w:val="16"/>
               </w:rPr>
-              <w:t xml:space="preserve">En el motor de Design (`/v1/index.html`, texto plano): `verifyHub: () =&gt; { if (this.state.hubCode.length === 6) { this.setState({ hubUnlocked: true }) … } }` — mira la LONGITUD, no el valor (`hubCode: ''`, sin comparación). Nuestra cortinilla esconde su `&lt;input placeholder="Enter code"&gt;` y su botón con `display:none` y los vuelve a esconder cada 900 ms, pero el motor los redibuja al cambiar de estado: en ese hueco, o quitando el `display:none` desde las herramientas del navegador, seis cifras cualesquiera abren la «BUILDER ROOM» estática de Design (`builderStack`, «Request repo access», «Explore the app» → demo) y la sala Pitch (su iframe y «Open full page ↗» apuntan a `/hub/…`, detrás de Access: en blanco para quien no sea founder).</w:t>
+              <w:t xml:space="preserve">En el motor de Design (`/v1/index.html`, texto plano): `verifyHub: () =&gt; { if (this.state.hubCode.length === 6) { this.setState({ hubUnlocked: true }) … } }` — mira la LONGITUD, no el valor (`hubCode: ''`, sin comparación). Nuestra cortinilla esconde su `&lt;input placeholder="Enter code"&gt;` y su botón con `display:none` UNA vez (el `setInterval` de 900 ms solo vuelve a montar la caja si ha desaparecido, no re-esconde el input), y el motor los redibuja al cambiar de estado: en ese hueco, o quitando el `display:none` desde las herramientas del navegador, seis cifras cualesquiera abren la «BUILDER ROOM» estática de Design (`builderStack`, «Request repo access», «Explore the app» → demo) y la sala Pitch (su iframe y «Open full page ↗» apuntan a `/hub/…`, detrás de Access: en blanco para quien no sea founder).</w:t>
             </w:r>
           </w:p>
         </w:tc>
@@ -1149,7 +1149,7 @@
                 <w:sz w:val="16"/>
                 <w:szCs w:val="16"/>
               </w:rPr>
-              <w:t xml:space="preserve">`room_gate.code` pasa a 8 cifras (`__CLAVE_PUERTA_8__`: la teclea Juanjo en el SQL antes de Run; no va a git ni al chat). Nueva `ns_room_challenge()` → `{challenge_id, positions[3]}` guardado en `room_gate_challenges` (uuid, posiciones, `ip_hash` de `request.headers`, `created_at`, `used`; caduca a los 3 min). `ns_room_gate_check(p_challenge uuid, p_digits text)`: UN intento por reto, compara las 3 cifras, marca `used`; si en 15 min hay ≥5 fallos para ese `ip_hash` → `{ok:false, wait:true}` hasta que pasen. La cortinilla pide las posiciones que devolvió el servidor (8 puntos, 3 marcados) y enseña «espera unos minutos» si hay bloqueo. La RPC vieja de 2 posiciones se retira en el mismo SQL (la web nueva sale a la vez: SQL → Deploy).</w:t>
+              <w:t xml:space="preserve">`room_gate.code` pasa a 8 cifras (`__CLAVE_PUERTA_8__`: la teclea Juanjo en el SQL antes de Run; no va a git ni al chat). Nueva `ns_room_challenge()` → `{challenge_id, positions[3]}` guardado en `room_gate_challenges` (uuid, posiciones, `ip_hash` = sha256(`cf-connecting-ip` primero, si no el primer `x-forwarded-for`, + sal), `created_at`, `used`; caduca a los 3 min; si esa IP ya tiene un reto abierto se devuelve el MISMO — sortear retos gratis hasta que salgan posiciones cómodas es la forma barata de atacar; ≤10 retos/15 min por IP). `ns_room_gate_check(p_challenge uuid, p_digits text)`: UN intento por reto, compara las 3 cifras, marca `used`; 10 fallos/15 min por IP o ≥50 fallos/15 min en total → `{ok:false, wait:true}` + fila en `security_alerts` (D11). Las tres tablas nuevas (`room_gate_challenges`, `team_key`, `admin_key_ok`) nacen con RLS activada y SIN políticas, `revoke all` a anon/authenticated: solo las RPC (security definer) las tocan. pg_cron horario borra retos viejos; tope de filas vivas. La cortinilla pide las posiciones que devolvió el servidor (8 puntos, 3 marcados) y enseña «Demasiados intentos: espera 15 minutos | Too many attempts: wait 15 minutes» si hay bloqueo (ES | EN). La RPC vieja de 2 posiciones SIGUE viva hasta que la web nueva esté en producción (SQL → Deploy → SQL de cierre que la retira): entre el Run y el deploy la cortinilla vieja no se queda muerta (r27-e, orden de entrega).</w:t>
             </w:r>
           </w:p>
         </w:tc>
@@ -1176,7 +1176,7 @@
                 <w:sz w:val="16"/>
                 <w:szCs w:val="16"/>
               </w:rPr>
-              <w:t xml:space="preserve">Arnés `tools/sql-arnes/2026-09-30-tres-llaves/`: reto caduca · reto no se reutiliza · 5 fallos bloquean (rojo) · acierto entra (verde) · posiciones fuera de rango → false. Vivo: incógnito, 5 fallos seguidos → bloqueo con mensaje; tras 15 min, entra. El código de la puerta no aparece en `publish/` (web-tests r14h, ampliado a 8 cifras).</w:t>
+              <w:t xml:space="preserve">Arnés `tools/sql-arnes/2026-09-30-tres-llaves/`: reto caduca · reto no se reutiliza · misma IP recibe el mismo reto abierto · 10 fallos por IP bloquean (rojo) · 50 fallos globales cierran la puerta y dejan alerta (rojo) · acierto entra (verde) · `set local role anon` + INSERT directo en `room_gate_challenges` → 42501 (la tabla no se escribe por REST). Vivo: incógnito, 10 fallos seguidos → bloqueo con mensaje; tras 15 min, entra. La clave de la puerta no está en git ni en `publish/`: web-tests r14h deja de buscar un literal (ya no existe) y pasa a exigir que junto a `ns-room-gate` no haya ningún número de 8 cifras y que la RPC llamada sea la de reto (`ns_room_challenge`).</w:t>
             </w:r>
           </w:p>
         </w:tc>
@@ -1235,7 +1235,7 @@
                 <w:sz w:val="16"/>
                 <w:szCs w:val="16"/>
               </w:rPr>
-              <w:t xml:space="preserve">Clave de equipo de 8 cifras (`team_key`, `__CLAVE_EQUIPO_8__`, distinta de la de la puerta si D4 = dos) y `ns_team_key_challenge()`/`ns_team_key_check()` SOLO para `authenticated` (después de la contraseña), mismo patrón de reto/límite que F2 (5 fallos/15 min por usuaria). Al acertar, fila en `admin_key_ok(user_id, session_id = auth.jwt()-&gt;&gt;'session_id', verified_at)`. `is_admin_mfa()` e `is_sa_admin()` v3: `es admin AND (aal = 'aal2' OR existe admin_key_ok para ESTA sesión con verified_at &gt; now() − 24 h)`. Así la tercera llave no es un adorno de la interfaz: sin ella, ninguna RPC admin responde. Si la cuenta tiene un factor TOTP verificado, la barra pide el TOTP (`nsMfaReforzar`, ya existe) y NO la clave (D10).</w:t>
+              <w:t xml:space="preserve">Clave de equipo de 8 cifras (`team_key`, `__CLAVE_EQUIPO_8__`, distinta de la de la puerta si D4 = dos) y `ns_team_key_challenge()`/`ns_team_key_check()` que devuelven `{ok:false}` a quien no esté en `admins` — comprobado DENTRO de la función, no solo por GRANT: en este proyecto toda tester de la app es `authenticated` — y, para las admins, mismo patrón de reto/límite que F2 (5 fallos/15 min por usuaria + cerrojo global ≥15 fallos/15 min entre todas, D11). Al acertar, la propia función inserta la fila en `admin_key_ok(user_id = auth.uid(), superficie hub|admin, session_id = auth.jwt()-&gt;&gt;'session_id', verified_at)` — nunca desde un parámetro —, ÚNICA por (persona, superficie) (D14); `ns_key_from_totp()` hace lo mismo tras un TOTP válido (exige `aal2` en el JWT), y el pase directo la hereda en dos pasos — fila pendiente de la Edge + `ns_key_claim()` del receptor (D15). `is_admin_mfa()` e `is_sa_admin()` v3: `es admin AND existe admin_key_ok para ESTA sesión con verified_at &gt; now() − 24 h` (sin rama «aal2» que salte la fila, D3). Así la tercera llave no es un adorno de la interfaz: sin fila, ninguna RPC admin responde. Si la cuenta tiene un factor TOTP verificado, la barra ofrece el TOTP (`nsMfaReforzar`, ya existe) con el enlace «usar la clave del equipo» debajo: cualquiera de los dos vale (D10). Todos los textos nuevos ES | EN (patrón `T(es,en)` de la barra).</w:t>
             </w:r>
           </w:p>
         </w:tc>
@@ -1262,7 +1262,7 @@
                 <w:sz w:val="16"/>
                 <w:szCs w:val="16"/>
               </w:rPr>
-              <w:t xml:space="preserve">Arnés SQL: `is_admin_mfa()` devuelve false con sesión aal1 sin fila; true con fila de esta sesión; false con fila de OTRA sesión o de hace 25 h; true con aal2. admin-tests: la última definición de `is_sa_admin` exige `aal2 OR admin_key_ok` (el test «un candado» se reescribe: hoy exige lo contrario). Vivo: tras la contraseña, sin la llave, el MIS enseña el reto y no datos.</w:t>
+              <w:t xml:space="preserve">Arnés SQL: `is_admin_mfa()` false sin fila (aal1 Y aal2); true con fila de esta sesión; false con fila de OTRA sesión o de hace 25 h; `ns_team_key_check()` false para una `authenticated` que no es admin; `set local role authenticated` + INSERT directo en `admin_key_ok` → 42501; 15 fallos globales cierran la llave y dejan alerta. admin-tests: la última definición de `is_sa_admin` exige la fila de `admin_key_ok` (el test «un candado» se reescribe: hoy exige lo contrario). Vivo: tras la contraseña, sin la llave, el MIS enseña el reto y no datos.</w:t>
             </w:r>
           </w:p>
         </w:tc>
@@ -1321,7 +1321,7 @@
                 <w:sz w:val="16"/>
                 <w:szCs w:val="16"/>
               </w:rPr>
-              <w:t xml:space="preserve">El login sale de las 28 páginas y pasa a la BARRA (`hub-navbar.html`, que ya está en todas): al cargar cualquier /hub, el `&lt;body&gt;` se oculta hasta tener (1) sesión de Supabase y (2) tercera llave de esta sesión (o aal2). Sin sesión → pantalla completa con correo + contraseña; con sesión sin llave → reto de 3 posiciones (u overlay TOTP). El gated de Design incluido: su contenido estático ya no se ve tras Access sin contraseña. Los bloques de login de cada página quedan (no molestan) y se retiran en goteo.</w:t>
+              <w:t xml:space="preserve">El login sale de las 28 páginas y pasa a la BARRA (`hub-navbar.html`, que ya está en todas): al cargar cualquier /hub, el `&lt;body&gt;` se oculta hasta tener (1) sesión de Supabase y (2) tercera llave de esta sesión (o aal2). Sin sesión → pantalla completa con correo + contraseña y «¿Olvidaste la contraseña? | Forgot password?» (`resetPasswordForEmail` → `reset.html`, que ya existe: hoy la recuperación es un curl de Juanjo); con sesión sin llave → reto de 3 posiciones (u overlay TOTP, con «usar la clave del equipo»). Todos los textos ES | EN; el muro no depende de una sola RPC: si `ns_key_session_ok()` no contesta, enseña el error con su nombre (r12-b9), nunca una página en blanco. El gated de Design incluido: su contenido estático ya no se ve tras Access sin contraseña. Los bloques de login de cada página quedan (no molestan) y se retiran en goteo.</w:t>
             </w:r>
           </w:p>
         </w:tc>
@@ -1380,7 +1380,7 @@
                 <w:sz w:val="16"/>
                 <w:szCs w:val="16"/>
               </w:rPr>
-              <w:t xml:space="preserve">F5 · Pestaña por defecto: Piloto (D7)</w:t>
+              <w:t xml:space="preserve">F5 · Un solo por defecto: Piloto (D7)</w:t>
             </w:r>
           </w:p>
         </w:tc>
@@ -1407,7 +1407,7 @@
                 <w:sz w:val="16"/>
                 <w:szCs w:val="16"/>
               </w:rPr>
-              <w:t xml:space="preserve">La cortinilla salta a `/hub/pilot.html` (hoy `?r=builders`) y `ns-default-route` sin hash manda a `pilot.html` en vez de `#/builders`. La pestaña ⌂ Overview (gated de Design) sigue en la barra para quien la quiera. StartUp Admin sigue donde está en la landing.</w:t>
+              <w:t xml:space="preserve">La cortinilla salta a `/hub/pilot.html` desde la tarjeta Builders y a `/hub/full-hub-gated-site.html?r=investors` desde la tarjeta Pitch (hoy `HUB` es una constante única: pasa a depender de la tarjeta pulsada); `ns-default-route` sin hash manda a `pilot.html` en vez de `#/builders`; `hub/index.html` (hoy → incidents.html) manda a `pilot.html`. ⌂ Overview sigue en la barra. StartUp Admin sigue donde está en la landing.</w:t>
             </w:r>
           </w:p>
         </w:tc>
@@ -1434,7 +1434,7 @@
                 <w:sz w:val="16"/>
                 <w:szCs w:val="16"/>
               </w:rPr>
-              <w:t xml:space="preserve">web-tests: `HUB=` de la cortinilla y el destino sin hash apuntan a pilot.html. Vivo: puerta → … → Piloto.</w:t>
+              <w:t xml:space="preserve">web-tests: se REESCRIBEN los dos tests `default-route` (líneas ~53–59: fallback e `r` inválido → pilot.html) y se añade el de los dos destinos de la cortinilla; smoke-prod: el check «v1: Builders entra con ?r=» (73–78) pasa a exigir los dos destinos nuevos. Vivo: puerta Builders → … → Piloto; puerta Pitch → … → Pitch.</w:t>
             </w:r>
           </w:p>
         </w:tc>
@@ -1520,7 +1520,7 @@
                 <w:sz w:val="16"/>
                 <w:szCs w:val="16"/>
               </w:rPr>
-              <w:t xml:space="preserve">admin-tests: `signInWithOtp` desaparece de `afterSignIn`/`bindGate`; `signInWithPassword` presente; forma nueva de `afterSignIn`. Vivo: admin. → Access → contraseña → llave → libros.</w:t>
+              <w:t xml:space="preserve">admin-tests, tres tests cambian: (1) «toda RPC que llama la página existe en el SQL» solo lee `2026-08-05-startup-admin.sql` (línea ~211) → pasa a buscar cada RPC en todo `backend-sql/` (si no, las RPC nuevas lo ponen en rojo y abortan el Deploy StartUp Admin); (2) `signInWithOtp` desaparece de `bindGate`, `signInWithPassword` presente, forma nueva de `afterSignIn`; (3) «un candado» → «tres llaves». Vivo: admin. → Access → contraseña → llave → libros.</w:t>
             </w:r>
           </w:p>
         </w:tc>
@@ -1579,7 +1579,7 @@
                 <w:sz w:val="16"/>
                 <w:szCs w:val="16"/>
               </w:rPr>
-              <w:t xml:space="preserve">La sala Pitch solo tiene contenido dentro de /hub (iframe y «Open full page ↗»): con F1 su cortinilla de cartón muere, con F4 el hub pide contraseña + llave. No hace falta una puerta aparte.</w:t>
+              <w:t xml:space="preserve">La sala Pitch solo tiene contenido dentro de /hub (iframe y «Open full page ↗»): con F1 su cortinilla de cartón muere, con F4 el hub pide contraseña + llave, y con F5 su tarjeta aterriza en Pitch (`?r=investors`). No hace falta una puerta aparte.</w:t>
             </w:r>
           </w:p>
         </w:tc>
@@ -1606,7 +1606,7 @@
                 <w:sz w:val="16"/>
                 <w:szCs w:val="16"/>
               </w:rPr>
-              <w:t xml:space="preserve">Vivo: `/v1/?sala=pitch` → cortinilla → hub → muro → llave → Pitch.</w:t>
+              <w:t xml:space="preserve">Vivo: `/v1/?sala=pitch` → cortinilla → Access → muro → llave → Pitch (`#/investors`).</w:t>
             </w:r>
           </w:p>
         </w:tc>
@@ -1665,7 +1665,7 @@
                 <w:sz w:val="16"/>
                 <w:szCs w:val="16"/>
               </w:rPr>
-              <w:t xml:space="preserve">Los ajustes de sesión del panel de Supabase (time-box, single session) NO se tocan: son de todo el proyecto y cerrarían cada día la app a las testers del piloto. Se hace con lo nuestro: (1) Cloudflare Zero Trust → Settings → Authentication → sesión global 24 h, y Access → Applications → hub y admin → Session Duration 24 h (panel, Juanjo; deshace UST-17 D2); (2) la fila de `admin_key_ok` caduca a las 24 h y es ÚNICA por persona: al verificar la llave en un dispositivo se borran las filas anteriores → la sesión antigua deja de pasar `is_admin_mfa()` en el siguiente RPC (una sola sesión, en el servidor); (3) la barra y adminsite llaman a `admin_session_ok()` (RPC ligera: ¿hay fila viva para ESTA sesión?) al cargar y cada 2 minutos: si no la hay, muro con el motivo («han pasado 24 h» o «has entrado desde otro dispositivo»); (4) cliente: `ns_login_ts` y cierre absoluto a las 24 h por si el servidor no contesta. El JWT de Supabase sigue vivo (a la app no le afecta), pero sin fila no hay hub. Inactividad: sigue apagada (`LIMITE=0`) salvo que D6 diga lo contrario.</w:t>
+              <w:t xml:space="preserve">Los ajustes de sesión del panel de Supabase (time-box, single session) NO se tocan: son de todo el proyecto y cerrarían cada día la app a las testers del piloto. Se hace con lo nuestro: (1) Cloudflare Zero Trust → Settings → Authentication → sesión global 24 h, y Access → Applications → hub y admin → Session Duration 24 h (panel, Juanjo; deshace UST-17 D2) y, el MISMO día del deploy de B, «Revoke existing tokens» en las dos aplicaciones (las cookies de 30 días emitidas desde el 26-sep siguen vivas hasta que caducan: si no se revocan, el iPhone «no pide el PIN» y parecerá un fallo). La sesión global es del team `larama-familia-2026`, que también sirve laramagonzalez.com: la familia también pasará a 24 h (declarado; alternativa: cuenta de Zero Trust aparte, fuera de alcance); (2) la fila de `admin_key_ok` caduca a las 24 h y es ÚNICA por (persona, superficie): al verificar la llave en un dispositivo se borra la anterior de esa superficie → la sesión antigua deja de pasar `is_admin_mfa()` en el siguiente RPC (una sola sesión por superficie, en el servidor; el pase directo copia la fila, D15); vale igual para quien entra con TOTP, porque el TOTP también acuña la fila (D3); (3) la barra y adminsite llaman a `ns_key_session_ok()` (RPC ligera: ¿hay fila viva para ESTA sesión?) al cargar y cada 2 minutos: si no la hay, muro con el motivo («han pasado 24 h» o «has entrado desde otro dispositivo»); (4) cliente: `ns_login_ts` y cierre absoluto a las 24 h por si el servidor no contesta — y al cerrar por 24 h, la barra manda a `/cdn-cgi/access/logout` y de ahí al muro, para que las tres caducidades colapsen en UN momento y la founder vea una sola secuencia PIN → contraseña → llave, no dos interrupciones separadas por minutos. Los avisos son inferencias, bilingües: «Tu sesión se cerró: han pasado 24 h | Your session closed: 24 hours have passed» · «Tu sesión se cerró: probablemente has entrado desde otro dispositivo (una sesión por persona) | Your session closed: most likely you signed in from another device (one session per person)». El JWT de Supabase sigue vivo (a la app no le afecta), pero sin fila no hay hub. Inactividad: sigue apagada (`LIMITE=0`) salvo que D6 diga lo contrario.</w:t>
             </w:r>
           </w:p>
         </w:tc>
@@ -1692,7 +1692,7 @@
                 <w:sz w:val="16"/>
                 <w:szCs w:val="16"/>
               </w:rPr>
-              <w:t xml:space="preserve">Arnés SQL: segunda verificación de la llave desde otra `session_id` borra la primera; `admin_session_ok()` false para la sesión vieja; fila de hace 25 h → false. Panel: captura de los ajustes de Access. Vivo: entrar en el iPhone estando dentro en el Mac → el Mac vuelve al muro en ≤2 min; a las 24 h de la llave, el muro con el aviso. Sonda: `admin_key_ok` tiene UNA fila por admin.</w:t>
+              <w:t xml:space="preserve">Arnés SQL: segunda verificación de la llave desde otra `session_id` borra la primera; `ns_key_session_ok()` false para la sesión vieja; fila de hace 25 h → false. Panel: captura de los ajustes de Access. Vivo: entrar en el iPhone estando dentro en el Mac → el Mac vuelve al muro en ≤2 min; a las 24 h de la llave, el muro con el aviso. Sonda: `admin_key_ok` tiene como mucho UNA fila por (admin, superficie).</w:t>
             </w:r>
           </w:p>
         </w:tc>
@@ -1751,7 +1751,7 @@
                 <w:sz w:val="16"/>
                 <w:szCs w:val="16"/>
               </w:rPr>
-              <w:t xml:space="preserve">`hub/access.html` (texto: tres llaves, 24 h, una sesión; la lista de correos sigue siendo foto), `documentation/user-guide` (línea de acceso), `CONTINUIDAD-Llaves-Compartidas.md` (las dos claves nuevas van al gestor compartido, NO al fichero), mensaje de una línea para Pilar, Lucía y María Paula (qué cambia mañana y por qué), Notion sin bloques → hub, CLAUDE.md (invariantes de seguridad: sustituyen a las de «un candado»).</w:t>
+              <w:t xml:space="preserve">la página de acceso del hub — su ÚNICA fuente es el bloque `_ACCESS_HTML` de `integrate.py` (líneas ~425–452), que se escribe en `publish/hub/access.html` en cada integración; el `hub/access.html` de la raíz del repo es un artefacto viejo (po213) que no se sirve y se marca como histórico — pasa a decir tres llaves, 24 h, una sesión por superficie; la lista de correos sigue siendo foto, `documentation/user-guide` (línea de acceso), `CONTINUIDAD-Llaves-Compartidas.md` (las dos claves nuevas van al gestor compartido, NO al fichero), mensaje de una línea para Pilar, Lucía y María Paula (qué cambia mañana y por qué), Notion sin bloques → hub, CLAUDE.md (invariantes de seguridad: sustituyen a las de «un candado»).</w:t>
             </w:r>
           </w:p>
         </w:tc>
@@ -1778,7 +1778,7 @@
                 <w:sz w:val="16"/>
                 <w:szCs w:val="16"/>
               </w:rPr>
-              <w:t xml:space="preserve">web-tests: access.html sin «30 days». Mensaje enviado (WhatsApp, lo manda Juanjo).</w:t>
+              <w:t xml:space="preserve">web-tests: access.html con «24h» y sin «30 days»; el muro y los tres avisos en ES y EN (como r14h con la cortinilla). Mensaje enviado (WhatsApp, lo manda Juanjo).</w:t>
             </w:r>
           </w:p>
         </w:tc>
@@ -2048,7 +2048,7 @@
                 <w:sz w:val="16"/>
                 <w:szCs w:val="16"/>
               </w:rPr>
-              <w:t xml:space="preserve">`integrate.py` (bloques `ns-room-gate` y `ns-default-route`), `_integration/hub-navbar.html` (muro + tercera llave + 24 h), `_integration/access.html` (texto), `docs/62-…` (este documento) · publish/ por Deploy: po268 (A) y po269+ (B).</w:t>
+              <w:t xml:space="preserve">`integrate.py` (bloques `ns-room-gate` y `ns-default-route`), `_integration/hub-navbar.html` (muro + tercera llave + 24 h + logout de Access), bloque `_ACCESS_HTML` de `integrate.py` (texto de la página de acceso), `hub/index.html` (→ pilot.html), `_integration/docs/62-…` (este documento) · Edge `pase-directo` (deja la fila pendiente de la llave) + receptores de la barra y adminsite (`ns_key_claim`) · publish/ por Deploy: po268 (A, hecho) y po269+ (B).</w:t>
             </w:r>
           </w:p>
         </w:tc>
@@ -2166,7 +2166,7 @@
                 <w:sz w:val="16"/>
                 <w:szCs w:val="16"/>
               </w:rPr>
-              <w:t xml:space="preserve">`2026-09-30-tres-llaves-a.sql` (nada: A es solo web) · `2026-09-30-tres-llaves-b.sql`: `room_gate` 8 cifras + `room_gate_challenges` + `ns_room_challenge`/`ns_room_gate_check` v2 (anon, con límite) · `team_key` + `ns_team_key_challenge`/`ns_team_key_check` (authenticated) · `admin_key_ok` · `is_admin_mfa`/`is_sa_admin` v3 · tablero. Placeholders `__CLAVE_PUERTA_8__` y `__CLAVE_EQUIPO_8__` que teclea Juanjo antes de Run (D5). Arnés `tools/sql-arnes/2026-09-30-tres-llaves/`.</w:t>
+              <w:t xml:space="preserve">`2026-09-30-tres-llaves-a.sql` (nada: A es solo web) · `2026-09-30-tres-llaves-b.sql`: `room_gate` 8 cifras + `room_gate_challenges` + `ns_room_challenge`/`ns_room_gate_check` v2 (anon, con límite) · `team_key` + `ns_team_key_challenge`/`ns_team_key_check` (solo admins, comprobado dentro) · `admin_key_ok` + `ns_key_from_totp` + `ns_key_claim` (pase directo, dos pasos) + `ns_key_session_ok` (¿hay fila viva para esta sesión?; sin prefijo admin_ a propósito: la regla 2c de sql-columnas) · `security_alerts` (+ línea en el digest) · cron de limpieza · `is_admin_mfa`/`is_sa_admin` v3 (admin AND fila ≤24 h) · las tres tablas con RLS sin políticas · tablero · y un SQL de CIERRE tras el deploy que retira la RPC vieja de 2 posiciones y registra el as-built. Placeholders `__CLAVE_PUERTA_8__` y `__CLAVE_EQUIPO_8__` que teclea Juanjo antes de Run (D5). Arnés `tools/sql-arnes/2026-09-30-tres-llaves/`.</w:t>
             </w:r>
           </w:p>
         </w:tc>
@@ -2284,7 +2284,7 @@
                 <w:sz w:val="16"/>
                 <w:szCs w:val="16"/>
               </w:rPr>
-              <w:t xml:space="preserve">`tools/web-tests.mjs` (+r27-p; se ajusta r14h a 8 cifras), `tools/admin-tests.mjs` (test «un candado» → «tres llaves»: la última definición exige aal2 O llave), `tools/smoke-prod.mjs` (+2 checks), arnés SQL nuevo.</w:t>
+              <w:t xml:space="preserve">`tools/web-tests.mjs`: r27-p (hecho) · r14h reescrito (sin literal; sin número de 8 cifras junto a la cortinilla; RPC de reto) · los dos `default-route` (~53–59) reescritos a pilot.html · destinos por tarjeta · muro y avisos en ES y EN · access.html con «24 h» y sin «30 days». `tools/admin-tests.mjs`: RPC-existe en todo backend-sql · «un candado» → «tres llaves» (la última definición exige la fila) · forma de `afterSignIn`. `tools/smoke-prod.mjs`: check F1 (hecho) · «Builders entra con ?r=» reescrito a los dos destinos · admin. sigue tras Access. Arnés SQL nuevo `tools/sql-arnes/2026-09-30-tres-llaves/` — PREVIO: los arneses existentes están escritos para el sandbox de Cowork (embedded-postgres linux-arm64, rutas /sessions/…); hace falta la receta darwin-arm64 en el Mac antes de que corra (media hora, dentro de la jornada de B).</w:t>
             </w:r>
           </w:p>
         </w:tc>
@@ -2343,7 +2343,7 @@
                 <w:sz w:val="16"/>
                 <w:szCs w:val="16"/>
               </w:rPr>
-              <w:t xml:space="preserve">Pilar, Lucía, María Paula y Juanjo: cada día y en cada dispositivo, PIN de Cloudflare por correo + contraseña + tercera llave (TOTP o 3 cifras) — UNA vez, y después 24 h sin retos. Cambiar de móvil a portátil cierra la sesión del otro (D14). Las testers y el público: nada (la web, la app y la PWA no cambian).</w:t>
+              <w:t xml:space="preserve">Pilar, Lucía, María Paula y Juanjo: cada día y en cada dispositivo, PIN de Cloudflare por correo + contraseña + tercera llave (TOTP o 3 cifras) — una vez al día POR DISPOSITIVO. Quien alterne móvil y portátil en el mismo día entra dos veces (una por dispositivo) y, con D14, la llave del móvil cierra la del portátil en esa superficie; saltar del hub a StartUp Admin no cuenta (el pase directo hereda la llave). Las testers y el público: nada (la web, la app y la PWA no cambian).</w:t>
             </w:r>
           </w:p>
         </w:tc>
@@ -2419,7 +2419,7 @@
           <w:sz w:val="20"/>
           <w:szCs w:val="20"/>
         </w:rPr>
-        <w:t xml:space="preserve">Estimación: Entrega A, 20 minutos (hecha, pendiente de D1 y del doble clic). Entrega B, una jornada: SQL + arnés (media), barra + adminsite + tests (media), verificación en dos dispositivos con Pilar y Lucía. Riesgo principal: el del 26-sep al revés — cuatro retos en fila dejaron fuera a las founders; por eso B se entrega en UN día, con los tres relojes a 24 h a la vez y con las founders probando ANTES de la primera caducidad (D12).</w:t>
+        <w:t xml:space="preserve">Estimación: Entrega A, 20 minutos (hecha, pendiente de D1 y del doble clic). Entrega B, una jornada: SQL + arnés (media), barra + adminsite + tests (media), verificación en dos dispositivos con Pilar y Lucía. Riesgo principal: el del 26-sep al revés — cuatro retos en fila dejaron fuera a las founders; por eso B se entrega en UN día, con Access, la llave del servidor y el cliente arrancando a la vez (sesiones de Access revocadas ese día) y con las founders probando ANTES de la primera caducidad (D12).</w:t>
       </w:r>
     </w:p>
     <w:p>
@@ -2436,7 +2436,7 @@
           <w:sz w:val="30"/>
           <w:szCs w:val="30"/>
         </w:rPr>
-        <w:t xml:space="preserve">5 · Decisiones (D1–D14: Juanjo, carril técnico; Pilar y Lucía corroboran y prueban — D12) — propuesta · alternativa</w:t>
+        <w:t xml:space="preserve">5 · Decisiones (D1–D15: Juanjo, carril técnico; Pilar y Lucía corroboran y prueban — D12) — propuesta · alternativa · D15 va antes que D14 porque D14 depende de ella</w:t>
       </w:r>
     </w:p>
     <w:tbl>
@@ -2684,7 +2684,7 @@
                 <w:sz w:val="16"/>
                 <w:szCs w:val="16"/>
               </w:rPr>
-              <w:t xml:space="preserve"/>
+              <w:t xml:space="preserve">HECHA (Juanjo desplegó po268 a las 00:25; verificado en vivo: 0 × «length === 6) {», 1 × «if (false) {», smoke verde).</w:t>
             </w:r>
           </w:p>
         </w:tc>
@@ -2743,7 +2743,7 @@
                 <w:sz w:val="16"/>
                 <w:szCs w:val="16"/>
               </w:rPr>
-              <w:t xml:space="preserve">ORDEN de las llaves: Cloudflare Access (PIN por correo) → contraseña de Supabase → tercera llave (TOTP si hay factor; si no, 3 de 8). Access va primero por construcción: vive en el borde de la red, antes de que exista una página donde teclear. La fuerza es la misma que en el orden del pedido; lo que cambia es que ningún desconocido llega siquiera al formulario de la contraseña.</w:t>
+              <w:t xml:space="preserve">ORDEN de las llaves: Cloudflare Access (PIN por correo) → contraseña de Supabase → tercera llave (TOTP si hay factor; si no, 3 de 8). Access va primero por construcción: vive en el borde de la red, antes de que exista una página donde teclear. La fuerza es la misma que en el orden del pedido; lo que cambia es que ningún desconocido llega siquiera al FORMULARIO de la contraseña (el endpoint de contraseña de Supabase es público con la anon key —la app lo usa—; Access esconde el formulario, no la comprobación: por eso la tercera llave y el límite de intentos van en el servidor).</w:t>
             </w:r>
           </w:p>
         </w:tc>
@@ -2857,7 +2857,7 @@
                 <w:sz w:val="16"/>
                 <w:szCs w:val="16"/>
               </w:rPr>
-              <w:t xml:space="preserve">La tercera llave se exige en el SERVIDOR: `is_admin_mfa()`/`is_sa_admin()` v3 = admin AND (aal2 OR llave verificada en esta sesión ≤24 h). Sin llave, ninguna RPC admin responde aunque alguien salte la interfaz.</w:t>
+              <w:t xml:space="preserve">La tercera llave se exige en el SERVIDOR y en TODAS las ramas: `is_admin_mfa()`/`is_sa_admin()` v3 = admin AND existe fila de `admin_key_ok` para ESTA sesión (`auth.jwt()-&gt;&gt;'session_id'`) con `verified_at &gt; now() − 24 h`. El TOTP no salta la fila: la OBTIENE (`ns_key_from_totp()` comprueba `aal2` en el JWT e inserta la misma fila que la clave). Así el reloj de 24 h y la unicidad por superficie valen igual para quien usa TOTP; con «aal2 O fila» no valdrían para nadie con TOTP (sesión sin caducidad absoluta). Sin fila, ninguna RPC admin responde aunque alguien salte la interfaz.</w:t>
             </w:r>
           </w:p>
         </w:tc>
@@ -3199,7 +3199,7 @@
                 <w:sz w:val="16"/>
                 <w:szCs w:val="16"/>
               </w:rPr>
-              <w:t xml:space="preserve">Sesión de 24 h SOLO para las admins, con dos relojes nuestros y uno de Cloudflare: Access global + las dos aplicaciones a 24 h (panel), la llave (`admin_key_ok`) caduca a las 24 h y lo comprueba el servidor en cada RPC, y la barra cierra a las 24 h con aviso. Los ajustes de sesión del panel de Supabase NO se tocan (son de todo el proyecto: echarían a las testers de la app cada día). Inactividad sigue APAGADA (la del 26-sep). Deshace UST-17 D2/D3; se declara.</w:t>
+              <w:t xml:space="preserve">Sesión de 24 h SOLO para las admins, con el reloj que manda en el servidor (la fila de `admin_key_ok` caduca a las 24 h y la comprueba cada RPC), el de Cloudflare (Access GLOBAL + las dos aplicaciones a 24 h, y revocar las sesiones vivas el día del deploy) y el del cliente (la barra cierra a las 24 h con aviso y sale también de Access). Colateral declarado: la sesión global de Zero Trust es de la cuenta y también sirve laramagonzalez.com → la familia pasa a 24 h. Es necesario para que el PIN por correo se pida cada día: con la global a 30 días, una aplicación a 24 h se renueva sin PIN. Los ajustes de sesión del panel de Supabase NO se tocan (son de todo el proyecto: echarían a las testers de la app cada día). Inactividad sigue APAGADA (la del 26-sep). Deshace UST-17 D2/D3; se declara.</w:t>
             </w:r>
           </w:p>
         </w:tc>
@@ -3226,7 +3226,7 @@
                 <w:sz w:val="16"/>
                 <w:szCs w:val="16"/>
               </w:rPr>
-              <w:t xml:space="preserve">Además, cierre por inactividad a los 30 min (UST-06 G1): más retos al día para las founders. Solo si Juanjo lo quiere.</w:t>
+              <w:t xml:space="preserve">Global a 30 días y solo las dos aplicaciones a 24 h: la familia no cambia, el PIN por correo vuelve cada 30 días por dispositivo, y las 24 h las impone igual la llave en el servidor (que es el reloj que de verdad protege). O además cierre por inactividad a los 30 min (UST-06 G1).</w:t>
             </w:r>
           </w:p>
         </w:tc>
@@ -3313,7 +3313,7 @@
                 <w:sz w:val="16"/>
                 <w:szCs w:val="16"/>
               </w:rPr>
-              <w:t xml:space="preserve">Pestaña por defecto: Piloto (`/hub/pilot.html`) tanto desde la cortinilla como sin ruta; ⌂ Overview sigue en la barra; StartUp Admin sigue donde está en la landing.</w:t>
+              <w:t xml:space="preserve">UN solo «por defecto»: Piloto (`/hub/pilot.html`) desde la tarjeta Builders de la cortinilla, desde el gated sin ruta y desde `/hub` (hoy `hub/index.html` manda a Incidencias, r16: quedarían tres destinos distintos). La tarjeta PITCH de la cortinilla lleva a Pitch (`?r=investors`, la vista que ya existe), no a Piloto — la cortinilla tiene hoy un destino fijo para las dos tarjetas y hay que darle uno por tarjeta. ⌂ Overview sigue en la barra; StartUp Admin sigue donde está en la landing.</w:t>
             </w:r>
           </w:p>
         </w:tc>
@@ -3340,7 +3340,7 @@
                 <w:sz w:val="16"/>
                 <w:szCs w:val="16"/>
               </w:rPr>
-              <w:t xml:space="preserve">Dejar `#/builders` (Overview de Design) como hoy.</w:t>
+              <w:t xml:space="preserve">Dejar `#/builders` (Overview de Design) como hoy y `/hub` en Incidencias.</w:t>
             </w:r>
           </w:p>
         </w:tc>
@@ -3427,7 +3427,7 @@
                 <w:sz w:val="16"/>
                 <w:szCs w:val="16"/>
               </w:rPr>
-              <w:t xml:space="preserve">Muro universal en la barra: en TODA página de /hub (incluido el gated de Design) no se pinta NADA hasta tener sesión y llave; los bloques de login de cada página se retiran en goteo.</w:t>
+              <w:t xml:space="preserve">Muro universal en la barra: en TODA página de /hub (incluido el gated de Design) no se pinta NADA hasta tener sesión y llave; los bloques de login de cada página se retiran en goteo. El muro es experiencia de uso (el HTML estático lo descarga igual quien pasó Access: las 8 founders); la garantía de seguridad es la del servidor — los DATOS solo salen por RPC y las RPC exigen la fila (D3).</w:t>
             </w:r>
           </w:p>
         </w:tc>
@@ -3655,7 +3655,7 @@
                 <w:sz w:val="16"/>
                 <w:szCs w:val="16"/>
               </w:rPr>
-              <w:t xml:space="preserve">TOTP opcional: si la cuenta tiene factor verificado se pide el TOTP (la sesión pasa a aal2) y NO la clave de equipo; sin factor, la clave. Nadie pierde su factor; `mfa.html` sigue.</w:t>
+              <w:t xml:space="preserve">TOTP opcional y NUNCA el único camino: quien tenga factor verificado ve el TOTP primero, pero puede elegir «usar la clave del equipo» (cualquiera de las dos vale como tercera llave y las dos acuñan la MISMA fila de `admin_key_ok`, D3); sin factor, la clave. Móvil perdido con TOTP = se entra con la clave y Juanjo retira el factor (`auth.admin` → DELETE factor, documentado en VERIF · Recuperación). Nadie pierde su factor; `mfa.html` sigue.</w:t>
             </w:r>
           </w:p>
         </w:tc>
@@ -3682,7 +3682,7 @@
                 <w:sz w:val="16"/>
                 <w:szCs w:val="16"/>
               </w:rPr>
-              <w:t xml:space="preserve">Siempre la clave de equipo, tenga o no TOTP.</w:t>
+              <w:t xml:space="preserve">TOTP obligatorio para quien lo tenga (sin la clave como alternativa): un móvil perdido deja fuera hasta que Juanjo retire el factor a mano.</w:t>
             </w:r>
           </w:p>
         </w:tc>
@@ -3769,7 +3769,7 @@
                 <w:sz w:val="16"/>
                 <w:szCs w:val="16"/>
               </w:rPr>
-              <w:t xml:space="preserve">Límites de intentos: puerta pública 5 fallos/15 min por IP (hash) y un intento por reto (3 min); clave de equipo 5 fallos/15 min por usuaria. Mensaje honesto («espera unos minutos»), no silencio.</w:t>
+              <w:t xml:space="preserve">Límites de intentos, en el servidor: PUERTA pública — un intento por reto (3 min), ≤10 retos/15 min por IP (hash con `cf-connecting-ip` primero + sal; se reutiliza el reto abierto de esa IP en vez de sortear otro), 10 fallos/15 min por IP (umbral alto: una oficina o el móvil tras CGNAT comparten IP), y un cerrojo GLOBAL: ≥50 fallos/15 min en la puerta, sea de donde sea → puerta cerrada 15 min + fila en `security_alerts` (la ve el digest). Limpieza por pg_cron cada hora (`created_at &lt; now() − 1 h`) y tope de filas vivas (la lección de las 630.083 filas). CLAVE DE EQUIPO — 5 fallos/15 min por usuaria y cerrojo global ≥15 fallos/15 min entre todas (el secreto es compartido: 100 cuentas de usar y tirar no deben sumar 500 intentos) → llave cerrada 15 min + alerta. Las founders siempre pueden entrar por /hub directo aunque la puerta pública esté cerrada. Mensajes honestos y bilingües, no silencio.</w:t>
             </w:r>
           </w:p>
         </w:tc>
@@ -4084,6 +4084,120 @@
                 <w:sz w:val="16"/>
                 <w:szCs w:val="16"/>
               </w:rPr>
+              <w:t xml:space="preserve">D15</w:t>
+            </w:r>
+          </w:p>
+        </w:tc>
+        <w:tc>
+          <w:tcPr>
+            <w:tcW w:type="dxa" w:w="3914"/>
+            <w:tcMar>
+              <w:top w:type="dxa" w:w="70"/>
+              <w:left w:type="dxa" w:w="100"/>
+              <w:bottom w:type="dxa" w:w="70"/>
+              <w:right w:type="dxa" w:w="100"/>
+            </w:tcMar>
+          </w:tcPr>
+          <w:p>
+            <w:pPr>
+              <w:spacing w:after="40"/>
+            </w:pPr>
+            <w:r>
+              <w:rPr>
+                <w:rFonts w:ascii="Aptos" w:cs="Aptos" w:eastAsia="Aptos" w:hAnsi="Aptos"/>
+                <w:b w:val="false"/>
+                <w:bCs w:val="false"/>
+                <w:color w:val="6B6B6B"/>
+                <w:sz w:val="16"/>
+                <w:szCs w:val="16"/>
+              </w:rPr>
+              <w:t xml:space="preserve">Pase directo hub ↔ StartUp Admin: SE CONSERVA y lleva la llave, en DOS pasos (la Edge acuña el pase y termina; la sesión nueva solo nace cuando el receptor lo consume en el navegador, así que la Edge no puede conocer su `session_id`): (1) la Edge `pase-directo` (service role; ya exige `admins`), si la sesión de origen tiene llave viva, deja una fila «pendiente» en `admin_key_ok` ligada al hash del pase (superficie destino, `session_id` nulo, caduca con el pase); (2) el receptor, justo tras `verify`, llama a `ns_key_claim(p_pase)` (authenticated) que ata esa fila a `auth.jwt()-&gt;&gt;'session_id'`. Sin llave de origen no hay fila pendiente y el salto pide la llave (correcto). Saltar de superficie no cuenta como otro dispositivo.</w:t>
+            </w:r>
+          </w:p>
+        </w:tc>
+        <w:tc>
+          <w:tcPr>
+            <w:tcW w:type="dxa" w:w="3296"/>
+            <w:tcMar>
+              <w:top w:type="dxa" w:w="70"/>
+              <w:left w:type="dxa" w:w="100"/>
+              <w:bottom w:type="dxa" w:w="70"/>
+              <w:right w:type="dxa" w:w="100"/>
+            </w:tcMar>
+          </w:tcPr>
+          <w:p>
+            <w:pPr>
+              <w:spacing w:after="40"/>
+            </w:pPr>
+            <w:r>
+              <w:rPr>
+                <w:rFonts w:ascii="Aptos" w:cs="Aptos" w:eastAsia="Aptos" w:hAnsi="Aptos"/>
+                <w:b w:val="false"/>
+                <w:bCs w:val="false"/>
+                <w:color w:val="6B6B6B"/>
+                <w:sz w:val="16"/>
+                <w:szCs w:val="16"/>
+              </w:rPr>
+              <w:t xml:space="preserve">Retirar el pase directo: con D9 StartUp Admin tiene la misma puerta (contraseña + llave), el salto sería un login normal más la llave — más simple, un reto más por día.</w:t>
+            </w:r>
+          </w:p>
+        </w:tc>
+        <w:tc>
+          <w:tcPr>
+            <w:tcW w:type="dxa" w:w="2575"/>
+            <w:shd w:fill="FFF6CC" w:val="clear"/>
+            <w:tcMar>
+              <w:top w:type="dxa" w:w="70"/>
+              <w:left w:type="dxa" w:w="100"/>
+              <w:bottom w:type="dxa" w:w="70"/>
+              <w:right w:type="dxa" w:w="100"/>
+            </w:tcMar>
+          </w:tcPr>
+          <w:p>
+            <w:pPr>
+              <w:spacing w:after="40"/>
+            </w:pPr>
+            <w:r>
+              <w:rPr>
+                <w:rFonts w:ascii="Aptos" w:cs="Aptos" w:eastAsia="Aptos" w:hAnsi="Aptos"/>
+                <w:b w:val="false"/>
+                <w:bCs w:val="false"/>
+                <w:color w:val="6B6B6B"/>
+                <w:sz w:val="16"/>
+                <w:szCs w:val="16"/>
+              </w:rPr>
+              <w:t xml:space="preserve"/>
+            </w:r>
+          </w:p>
+        </w:tc>
+      </w:tr>
+      <w:tr>
+        <w:trPr>
+          <w:cantSplit/>
+        </w:trPr>
+        <w:tc>
+          <w:tcPr>
+            <w:tcW w:type="dxa" w:w="515"/>
+            <w:tcMar>
+              <w:top w:type="dxa" w:w="70"/>
+              <w:left w:type="dxa" w:w="100"/>
+              <w:bottom w:type="dxa" w:w="70"/>
+              <w:right w:type="dxa" w:w="100"/>
+            </w:tcMar>
+          </w:tcPr>
+          <w:p>
+            <w:pPr>
+              <w:spacing w:after="40"/>
+            </w:pPr>
+            <w:r>
+              <w:rPr>
+                <w:rFonts w:ascii="Aptos" w:cs="Aptos" w:eastAsia="Aptos" w:hAnsi="Aptos"/>
+                <w:b/>
+                <w:bCs/>
+                <w:color w:val="6B6B6B"/>
+                <w:sz w:val="16"/>
+                <w:szCs w:val="16"/>
+              </w:rPr>
               <w:t xml:space="preserve">D14</w:t>
             </w:r>
           </w:p>
@@ -4111,7 +4225,7 @@
                 <w:sz w:val="16"/>
                 <w:szCs w:val="16"/>
               </w:rPr>
-              <w:t xml:space="preserve">UNA sesión abierta por persona, SOLO para las admins: la fila de `admin_key_ok` es única por persona — verificar la llave en un dispositivo borra la del anterior, que pierde el hub en el siguiente RPC (≤2 min) y ve el muro con «has entrado desde otro dispositivo». NO se usa «Single session per user» del panel de Supabase: es de todo el proyecto y cerraría la app a cualquier tester que la abriera en dos dispositivos. Access no tiene este ajuste, y no hace falta: sin llave no se ve nada (D3, D8).</w:t>
+              <w:t xml:space="preserve">UNA sesión abierta por persona y por SUPERFICIE (hub · StartUp Admin), SOLO para las admins: la fila de `admin_key_ok` es única por (persona, superficie) — verificar la llave en un dispositivo borra la del anterior en esa superficie, que pierde el hub en el siguiente RPC (≤2 min) y ve el muro con el aviso. El pase directo hub ↔ StartUp Admin NO cuenta como otro dispositivo: la Edge `pase-directo` (service role, ya comprueba `admins`) copia la llave a la sesión nueva cuando la de origen la tiene — si no, el salto pediría la tercera llave otra vez y al volver, contraseña y llave (el 26-sep). NO se usa «Single session per user» del panel de Supabase (es de todo el proyecto: cerraría la app a cualquier tester con dos dispositivos) ni `signOut({scope:'others'})` (cerraría la app en el móvil de una founder que también es tester). Access no tiene este ajuste, y no hace falta: sin llave no se ve nada (D3, D8).</w:t>
             </w:r>
           </w:p>
         </w:tc>
@@ -4353,7 +4467,7 @@
                 <w:sz w:val="16"/>
                 <w:szCs w:val="16"/>
               </w:rPr>
-              <w:t xml:space="preserve">A · tras el deploy</w:t>
+              <w:t xml:space="preserve">A · tras el deploy (MEDIDO 30-sep 00:27)</w:t>
             </w:r>
           </w:p>
         </w:tc>
@@ -4380,7 +4494,7 @@
                 <w:sz w:val="16"/>
                 <w:szCs w:val="16"/>
               </w:rPr>
-              <w:t xml:space="preserve">curl `/v1/`: 0 apariciones de `hubCode.length === 6) {`; cortinilla intacta (`ns-room-gate`, `ns_room_gate_check`); smoke-prod verde; a mano: seis cifras en el input de Design no abren nada.</w:t>
+              <w:t xml:space="preserve">curl `/v1/` en vivo: 0 apariciones de `hubCode.length === 6) {`, 1 de `verifyHub: () =&gt; { if (false) {`, cortinilla y RPC presentes (1 · 1); raíz con sello 3009-001913; /hub/full-hub-gated-site.html → 302 a Access; smoke-prod del Deploy: «v1: el motor de Design no desbloquea la sala por longitud (UST-27 F1)» ✓ y producción sana. Pendiente a mano (Juanjo o una founder): seis cifras en el input de Design destapado no abren nada.</w:t>
             </w:r>
           </w:p>
         </w:tc>
@@ -4499,6 +4613,124 @@
                 <w:szCs w:val="16"/>
               </w:rPr>
               <w:t xml:space="preserve">Incógnito escritorio + iPhone: Access → contraseña → llave → Piloto; 5 fallos → bloqueo; la llave en el móvil cierra el Mac en ≤2 min; a las 24 h, el muro. La app de una tester sigue abierta (nada del proyecto cambió). Logs de Access: solo los 8 correos. Pilar y Lucía: «entro» desde los dos dispositivos (D12).</w:t>
+            </w:r>
+          </w:p>
+        </w:tc>
+      </w:tr>
+      <w:tr>
+        <w:trPr>
+          <w:cantSplit/>
+        </w:trPr>
+        <w:tc>
+          <w:tcPr>
+            <w:tcW w:type="dxa" w:w="2266"/>
+            <w:tcMar>
+              <w:top w:type="dxa" w:w="70"/>
+              <w:left w:type="dxa" w:w="100"/>
+              <w:bottom w:type="dxa" w:w="70"/>
+              <w:right w:type="dxa" w:w="100"/>
+            </w:tcMar>
+          </w:tcPr>
+          <w:p>
+            <w:pPr>
+              <w:spacing w:after="40"/>
+            </w:pPr>
+            <w:r>
+              <w:rPr>
+                <w:rFonts w:ascii="Aptos" w:cs="Aptos" w:eastAsia="Aptos" w:hAnsi="Aptos"/>
+                <w:b/>
+                <w:bCs/>
+                <w:color w:val="6B6B6B"/>
+                <w:sz w:val="16"/>
+                <w:szCs w:val="16"/>
+              </w:rPr>
+              <w:t xml:space="preserve">Recuperación (autoservicio o quién)</w:t>
+            </w:r>
+          </w:p>
+        </w:tc>
+        <w:tc>
+          <w:tcPr>
+            <w:tcW w:type="dxa" w:w="8034"/>
+            <w:tcMar>
+              <w:top w:type="dxa" w:w="70"/>
+              <w:left w:type="dxa" w:w="100"/>
+              <w:bottom w:type="dxa" w:w="70"/>
+              <w:right w:type="dxa" w:w="100"/>
+            </w:tcMar>
+          </w:tcPr>
+          <w:p>
+            <w:pPr>
+              <w:spacing w:after="40"/>
+            </w:pPr>
+            <w:r>
+              <w:rPr>
+                <w:rFonts w:ascii="Aptos" w:cs="Aptos" w:eastAsia="Aptos" w:hAnsi="Aptos"/>
+                <w:b w:val="false"/>
+                <w:bCs w:val="false"/>
+                <w:color w:val="6B6B6B"/>
+                <w:sz w:val="16"/>
+                <w:szCs w:val="16"/>
+              </w:rPr>
+              <w:t xml:space="preserve">Contraseña olvidada: enlace del muro → correo de Supabase → `reset.html` (autoservicio). TOTP con móvil perdido: se entra con la clave del equipo (D10) y Juanjo retira el factor (`auth.admin.mfa.deleteFactor`, receta en secrets/README). Clave del equipo olvidada: ficha «Clave del equipo NutriSync» en el gestor compartido (custodia: Juanjo; copia: Pilar). Clave de la puerta: ídem; y las founders no la necesitan (entran por /hub/pilot.html en favoritos). Bloqueo por 5 fallos: 15 minutos, sin llamar a nadie.</w:t>
+            </w:r>
+          </w:p>
+        </w:tc>
+      </w:tr>
+      <w:tr>
+        <w:trPr>
+          <w:cantSplit/>
+        </w:trPr>
+        <w:tc>
+          <w:tcPr>
+            <w:tcW w:type="dxa" w:w="2266"/>
+            <w:tcMar>
+              <w:top w:type="dxa" w:w="70"/>
+              <w:left w:type="dxa" w:w="100"/>
+              <w:bottom w:type="dxa" w:w="70"/>
+              <w:right w:type="dxa" w:w="100"/>
+            </w:tcMar>
+          </w:tcPr>
+          <w:p>
+            <w:pPr>
+              <w:spacing w:after="40"/>
+            </w:pPr>
+            <w:r>
+              <w:rPr>
+                <w:rFonts w:ascii="Aptos" w:cs="Aptos" w:eastAsia="Aptos" w:hAnsi="Aptos"/>
+                <w:b/>
+                <w:bCs/>
+                <w:color w:val="6B6B6B"/>
+                <w:sz w:val="16"/>
+                <w:szCs w:val="16"/>
+              </w:rPr>
+              <w:t xml:space="preserve">Marcha atrás (ajuste por ajuste, quién)</w:t>
+            </w:r>
+          </w:p>
+        </w:tc>
+        <w:tc>
+          <w:tcPr>
+            <w:tcW w:type="dxa" w:w="8034"/>
+            <w:tcMar>
+              <w:top w:type="dxa" w:w="70"/>
+              <w:left w:type="dxa" w:w="100"/>
+              <w:bottom w:type="dxa" w:w="70"/>
+              <w:right w:type="dxa" w:w="100"/>
+            </w:tcMar>
+          </w:tcPr>
+          <w:p>
+            <w:pPr>
+              <w:spacing w:after="40"/>
+            </w:pPr>
+            <w:r>
+              <w:rPr>
+                <w:rFonts w:ascii="Aptos" w:cs="Aptos" w:eastAsia="Aptos" w:hAnsi="Aptos"/>
+                <w:b w:val="false"/>
+                <w:bCs w:val="false"/>
+                <w:color w:val="6B6B6B"/>
+                <w:sz w:val="16"/>
+                <w:szCs w:val="16"/>
+              </w:rPr>
+              <w:t xml:space="preserve">Access global + 2 apps → «1 month» (Juanjo, panel). SQL → `create or replace` de `is_admin_mfa`/`is_sa_admin` desde `2026-09-26-un-candado-auth.sql` (Juanjo, bandeja; `admin_key_ok`, `team_key` y los retos pueden quedarse: sin RPC que los exija no molestan). Hub → Pages → Deployments → Rollback a po268 (Juanjo) — el muro es JS de la barra: si la RPC `ns_key_session_ok` no contesta enseña el error, no una página en blanco. StartUp Admin → Pages → Rollback (Juanjo). Edge `pase-directo` → redeploy de la versión anterior (Juanjo, `.command`).</w:t>
             </w:r>
           </w:p>
         </w:tc>
@@ -4591,7 +4823,7 @@
           <w:sz w:val="20"/>
           <w:szCs w:val="20"/>
         </w:rPr>
-        <w:t xml:space="preserve">1. Escritorio, ventana de incógnito: nutrisynccollective.com → pie → Builders → completa las TRES posiciones marcadas de la clave de la puerta (8 puntos). Debe pedir el PIN de Cloudflare por correo, luego tu contraseña del hub y luego tu tercera llave (el código de tu app de autenticación si la tienes; si no, tres posiciones de la clave del equipo). Después: Piloto, sin más preguntas.</w:t>
+        <w:t xml:space="preserve">1. Antes de empezar: ten a mano tu contraseña del hub, tu Gmail (llega el PIN de Cloudflare) y la ficha «Clave del equipo NutriSync» del gestor compartido (8 cifras; te pedirán 3 posiciones). Si tienes app de autenticación, también vale.</w:t>
       </w:r>
     </w:p>
     <w:p>
@@ -4605,7 +4837,7 @@
           <w:sz w:val="20"/>
           <w:szCs w:val="20"/>
         </w:rPr>
-        <w:t xml:space="preserve">2. iPhone, Safari: lo mismo. Al verificar tu llave en el iPhone, la sesión del escritorio se cierra sola en un par de minutos (una sesión por persona): en el Mac aparece el muro con el aviso «has entrado desde otro dispositivo».</w:t>
+        <w:t xml:space="preserve">2. Escritorio, ventana de incógnito: abre nutrisynccollective.com/hub/pilot.html (tu favorito). Debe pedir, en este orden: el PIN de Cloudflare por correo, tu contraseña y tu tercera llave (el código de la app de autenticación si la tienes, o tres posiciones de la clave del equipo — puedes elegir). Después: Piloto, sin más preguntas hasta mañana. Todo en español e inglés.</w:t>
       </w:r>
     </w:p>
     <w:p>
@@ -4619,7 +4851,7 @@
           <w:sz w:val="20"/>
           <w:szCs w:val="20"/>
         </w:rPr>
-        <w:t xml:space="preserve">3. Falla la clave 5 veces seguidas: debe decir que esperes unos minutos; a los 15 vuelve a dejarte.</w:t>
+        <w:t xml:space="preserve">3. iPhone, Safari: lo mismo. Si NO te pide el PIN de Cloudflare es que la sesión antigua de 30 días sigue viva: dilo (no es un fallo) y Juanjo la revoca. Al verificar tu llave en el iPhone, en el Mac verás el muro al recargar o en menos de dos minutos, con el aviso «probablemente has entrado desde otro dispositivo».</w:t>
       </w:r>
     </w:p>
     <w:p>
@@ -4633,7 +4865,7 @@
           <w:sz w:val="20"/>
           <w:szCs w:val="20"/>
         </w:rPr>
-        <w:t xml:space="preserve">4. Al día siguiente (24 h después de entrar): vuelve a pedir PIN + contraseña + llave, con un aviso que lo explica. Antes de esas 24 h, nada.</w:t>
+        <w:t xml:space="preserve">4. Desde el hub, pulsa StartUp Admin: debe entrar SIN pedirte otra vez contraseña ni llave (el pase directo hereda la llave). Ya no llega el código de 6 cifras por correo de Supabase.</w:t>
       </w:r>
     </w:p>
     <w:p>
@@ -4647,7 +4879,7 @@
           <w:sz w:val="20"/>
           <w:szCs w:val="20"/>
         </w:rPr>
-        <w:t xml:space="preserve">5. admin.nutrisynccollective.com: PIN de Cloudflare → contraseña → llave → libros. Ya no llega el código de 6 cifras por correo de Supabase.</w:t>
+        <w:t xml:space="preserve">5. Al día siguiente (24 h después de entrar): vuelve a pedir PIN + contraseña + llave, con el aviso «han pasado 24 h». Antes de esas 24 h, nada.</w:t>
       </w:r>
     </w:p>
     <w:p>
@@ -4661,7 +4893,21 @@
           <w:sz w:val="20"/>
           <w:szCs w:val="20"/>
         </w:rPr>
-        <w:t xml:space="preserve">6. Si algo no entra, di QUÉ pantalla y a QUÉ hora (captura): cada capa deja rastro distinto (Logs de Access · auth de Supabase · admin_key_ok).</w:t>
+        <w:t xml:space="preserve">6. AL FINAL, y solo con la clave del EQUIPO (no con la de la puerta): falla la llave 5 veces seguidas. Debe decir que esperes 15 minutos; te bloquea solo a ti, y a los 15 vuelve a dejarte. No lo hagas con la clave de la puerta de la web: bloquearía 15 minutos a toda tu red (casa u oficina).</w:t>
+      </w:r>
+    </w:p>
+    <w:p>
+      <w:pPr>
+        <w:spacing w:after="120" w:before="0"/>
+      </w:pPr>
+      <w:r>
+        <w:rPr>
+          <w:rFonts w:ascii="Aptos" w:cs="Aptos" w:eastAsia="Aptos" w:hAnsi="Aptos"/>
+          <w:color w:val="1A1818"/>
+          <w:sz w:val="20"/>
+          <w:szCs w:val="20"/>
+        </w:rPr>
+        <w:t xml:space="preserve">7. Si algo no entra, di QUÉ pantalla y a QUÉ hora (captura): cada capa deja rastro distinto (Logs de Access · auth de Supabase · admin_key_ok).</w:t>
       </w:r>
     </w:p>
     <w:p>
@@ -5081,6 +5327,124 @@
                 <w:sz w:val="16"/>
                 <w:szCs w:val="16"/>
               </w:rPr>
+              <w:t xml:space="preserve">Un factor sin camino de vuelta es un bloqueo con fecha</w:t>
+            </w:r>
+          </w:p>
+        </w:tc>
+        <w:tc>
+          <w:tcPr>
+            <w:tcW w:type="dxa" w:w="7622"/>
+            <w:tcMar>
+              <w:top w:type="dxa" w:w="70"/>
+              <w:left w:type="dxa" w:w="100"/>
+              <w:bottom w:type="dxa" w:w="70"/>
+              <w:right w:type="dxa" w:w="100"/>
+            </w:tcMar>
+          </w:tcPr>
+          <w:p>
+            <w:pPr>
+              <w:spacing w:after="40"/>
+            </w:pPr>
+            <w:r>
+              <w:rPr>
+                <w:rFonts w:ascii="Aptos" w:cs="Aptos" w:eastAsia="Aptos" w:hAnsi="Aptos"/>
+                <w:b w:val="false"/>
+                <w:bCs w:val="false"/>
+                <w:color w:val="6B6B6B"/>
+                <w:sz w:val="16"/>
+                <w:szCs w:val="16"/>
+              </w:rPr>
+              <w:t xml:space="preserve">TOTP sin alternativa, contraseña sin «olvidé», llave sin ficha: cada uno deja fuera a una founder hasta que alguien con acceso técnico la rescate (26-sep). Toda llave nace con su recuperación escrita y con quién la ejecuta (VERIF · Recuperación).</w:t>
+            </w:r>
+          </w:p>
+        </w:tc>
+      </w:tr>
+      <w:tr>
+        <w:trPr>
+          <w:cantSplit/>
+        </w:trPr>
+        <w:tc>
+          <w:tcPr>
+            <w:tcW w:type="dxa" w:w="2678"/>
+            <w:tcMar>
+              <w:top w:type="dxa" w:w="70"/>
+              <w:left w:type="dxa" w:w="100"/>
+              <w:bottom w:type="dxa" w:w="70"/>
+              <w:right w:type="dxa" w:w="100"/>
+            </w:tcMar>
+          </w:tcPr>
+          <w:p>
+            <w:pPr>
+              <w:spacing w:after="40"/>
+            </w:pPr>
+            <w:r>
+              <w:rPr>
+                <w:rFonts w:ascii="Aptos" w:cs="Aptos" w:eastAsia="Aptos" w:hAnsi="Aptos"/>
+                <w:b/>
+                <w:bCs/>
+                <w:color w:val="6B6B6B"/>
+                <w:sz w:val="16"/>
+                <w:szCs w:val="16"/>
+              </w:rPr>
+              <w:t xml:space="preserve">El pase directo acuña sesión nueva: «una sesión» se define por superficie</w:t>
+            </w:r>
+          </w:p>
+        </w:tc>
+        <w:tc>
+          <w:tcPr>
+            <w:tcW w:type="dxa" w:w="7622"/>
+            <w:tcMar>
+              <w:top w:type="dxa" w:w="70"/>
+              <w:left w:type="dxa" w:w="100"/>
+              <w:bottom w:type="dxa" w:w="70"/>
+              <w:right w:type="dxa" w:w="100"/>
+            </w:tcMar>
+          </w:tcPr>
+          <w:p>
+            <w:pPr>
+              <w:spacing w:after="40"/>
+            </w:pPr>
+            <w:r>
+              <w:rPr>
+                <w:rFonts w:ascii="Aptos" w:cs="Aptos" w:eastAsia="Aptos" w:hAnsi="Aptos"/>
+                <w:b w:val="false"/>
+                <w:bCs w:val="false"/>
+                <w:color w:val="6B6B6B"/>
+                <w:sz w:val="16"/>
+                <w:szCs w:val="16"/>
+              </w:rPr>
+              <w:t xml:space="preserve">Hub → StartUp Admin crea otra `session_id`; una regla ingenua de «una sesión por persona» mataría el hub en cada salto. La llave se copia en la Edge y la unicidad es por (persona, superficie).</w:t>
+            </w:r>
+          </w:p>
+        </w:tc>
+      </w:tr>
+      <w:tr>
+        <w:trPr>
+          <w:cantSplit/>
+        </w:trPr>
+        <w:tc>
+          <w:tcPr>
+            <w:tcW w:type="dxa" w:w="2678"/>
+            <w:tcMar>
+              <w:top w:type="dxa" w:w="70"/>
+              <w:left w:type="dxa" w:w="100"/>
+              <w:bottom w:type="dxa" w:w="70"/>
+              <w:right w:type="dxa" w:w="100"/>
+            </w:tcMar>
+          </w:tcPr>
+          <w:p>
+            <w:pPr>
+              <w:spacing w:after="40"/>
+            </w:pPr>
+            <w:r>
+              <w:rPr>
+                <w:rFonts w:ascii="Aptos" w:cs="Aptos" w:eastAsia="Aptos" w:hAnsi="Aptos"/>
+                <w:b/>
+                <w:bCs/>
+                <w:color w:val="6B6B6B"/>
+                <w:sz w:val="16"/>
+                <w:szCs w:val="16"/>
+              </w:rPr>
               <w:t xml:space="preserve">`PEDIDO.extra` son objetos {titulo, texto}</w:t>
             </w:r>
           </w:p>
@@ -5263,7 +5627,7 @@
                 <w:sz w:val="16"/>
                 <w:szCs w:val="16"/>
               </w:rPr>
-              <w:t xml:space="preserve">Este documento (propuesta, 30-sep madrugada) · D1–D14 fila a fila · Entrega A y B separadas.</w:t>
+              <w:t xml:space="preserve">Este documento (propuesta, 30-sep madrugada) · D1–D15 fila a fila · Entrega A y B separadas.</w:t>
             </w:r>
           </w:p>
         </w:tc>
@@ -5322,7 +5686,7 @@
                 <w:sz w:val="16"/>
                 <w:szCs w:val="16"/>
               </w:rPr>
-              <w:t xml:space="preserve">Juanjo (D1–D14, carril técnico) · Pilar y Lucía corroboran y PRUEBAN (D12) · María Paula avisada (entra igual).</w:t>
+              <w:t xml:space="preserve">Juanjo (D1–D15, carril técnico) · Pilar y Lucía corroboran y PRUEBAN (D12) · María Paula avisada (entra igual).</w:t>
             </w:r>
           </w:p>
         </w:tc>
@@ -5558,7 +5922,7 @@
                 <w:sz w:val="16"/>
                 <w:szCs w:val="16"/>
               </w:rPr>
-              <w:t xml:space="preserve">Incógnito + iPhone, 5 fallos, cambio de dispositivo, 24 h · Logs de Access · sonda `auth.sessions`.</w:t>
+              <w:t xml:space="preserve">Incógnito + iPhone, 5 fallos, cambio de dispositivo, salto al StartUp Admin, 24 h · Logs de Access · sonda `admin_key_ok` (≤1 fila por admin y superficie) · `security_alerts` vacía.</w:t>
             </w:r>
           </w:p>
         </w:tc>
@@ -5830,7 +6194,7 @@
                 <w:sz w:val="16"/>
                 <w:szCs w:val="16"/>
               </w:rPr>
-              <w:t xml:space="preserve">Ingeniería y producto — decide D1–D14 (carril técnico)</w:t>
+              <w:t xml:space="preserve">Ingeniería y producto — decide D1–D15 (carril técnico)</w:t>
             </w:r>
           </w:p>
         </w:tc>

</xml_diff>

<commit_message>
UST-27 B (po269, revisada): al caducar las 24 h la barra no sale de Access (logout local + muro con motivo); doc 62 con desviaciones
Revisión de cuatro lentes: la cookie de Access (24 h desde el PIN) caduca antes que nuestro reloj (que arranca después);
salir de Access al caducar mandaba a la founder a la página de logout justo tras el PIN del 2º día. Ahora: logout
local de Supabase + muro «han pasado 24 h»; Access vuelve a pedir el PIN con su propio reloj. F8(4) desviada, declarada.
Doc 62: fila «Desviaciones antes del deploy»; PDF, .sha256 y -SIGNED regenerados.

Co-Authored-By: Claude Fable 5.1 <noreply@anthropic.com>
</commit_message>
<xml_diff>
--- a/_integration/docs/ust/UST-2026-09-30-27-tres-llaves-hub-admin-salas.docx
+++ b/_integration/docs/ust/UST-2026-09-30-27-tres-llaves-hub-admin-salas.docx
@@ -4672,6 +4672,65 @@
                 <w:szCs w:val="16"/>
               </w:rPr>
               <w:t xml:space="preserve">Contraseña olvidada: enlace del muro → correo de Supabase → `reset.html` (autoservicio). TOTP con móvil perdido: se entra con la clave del equipo (D10) y Juanjo retira el factor (`auth.admin.mfa.deleteFactor`, receta en secrets/README). Clave del equipo olvidada: ficha «Clave del equipo NutriSync» en el gestor compartido (custodia: Juanjo; copia: Pilar). Clave de la puerta: ídem; y las founders no la necesitan (entran por /hub/pilot.html en favoritos). Bloqueo por 5 fallos: 15 minutos, sin llamar a nadie.</w:t>
+            </w:r>
+          </w:p>
+        </w:tc>
+      </w:tr>
+      <w:tr>
+        <w:trPr>
+          <w:cantSplit/>
+        </w:trPr>
+        <w:tc>
+          <w:tcPr>
+            <w:tcW w:type="dxa" w:w="2266"/>
+            <w:tcMar>
+              <w:top w:type="dxa" w:w="70"/>
+              <w:left w:type="dxa" w:w="100"/>
+              <w:bottom w:type="dxa" w:w="70"/>
+              <w:right w:type="dxa" w:w="100"/>
+            </w:tcMar>
+          </w:tcPr>
+          <w:p>
+            <w:pPr>
+              <w:spacing w:after="40"/>
+            </w:pPr>
+            <w:r>
+              <w:rPr>
+                <w:rFonts w:ascii="Aptos" w:cs="Aptos" w:eastAsia="Aptos" w:hAnsi="Aptos"/>
+                <w:b/>
+                <w:bCs/>
+                <w:color w:val="6B6B6B"/>
+                <w:sz w:val="16"/>
+                <w:szCs w:val="16"/>
+              </w:rPr>
+              <w:t xml:space="preserve">Desviaciones antes del deploy (revisión de cuatro lentes sobre B, 30-sep 01:4x)</w:t>
+            </w:r>
+          </w:p>
+        </w:tc>
+        <w:tc>
+          <w:tcPr>
+            <w:tcW w:type="dxa" w:w="8034"/>
+            <w:tcMar>
+              <w:top w:type="dxa" w:w="70"/>
+              <w:left w:type="dxa" w:w="100"/>
+              <w:bottom w:type="dxa" w:w="70"/>
+              <w:right w:type="dxa" w:w="100"/>
+            </w:tcMar>
+          </w:tcPr>
+          <w:p>
+            <w:pPr>
+              <w:spacing w:after="40"/>
+            </w:pPr>
+            <w:r>
+              <w:rPr>
+                <w:rFonts w:ascii="Aptos" w:cs="Aptos" w:eastAsia="Aptos" w:hAnsi="Aptos"/>
+                <w:b w:val="false"/>
+                <w:bCs w:val="false"/>
+                <w:color w:val="6B6B6B"/>
+                <w:sz w:val="16"/>
+                <w:szCs w:val="16"/>
+              </w:rPr>
+              <w:t xml:space="preserve">(1) El SQL B se parte en DOS: parte 1 (tablas, RPC, puente con límites para la RPC vieja) y parte 2 (puertas v3) que se ejecuta AL FINAL, con web, StartUp Admin y Edge servidos — cero ventana en la que la web vieja pida datos sin llave. (2) F8(4) cambia: al caducar el reloj de 24 h NO se sale de Cloudflare Access (su cookie caduca antes que nuestro reloj y el 2º día mandaba a la founder a la página de logout justo tras el PIN); solo se cierra Supabase en ese dispositivo (scope local) y se enseña el muro con el motivo. (3) StartUp Admin: `signOut({scope:'local'})` (el global cerraría la app en el móvil de una founder). (4) La Edge no hereda una llave sustituida (`superseded_at is null`). (5) La RPC vieja de 2 posiciones queda con los mismos límites por IP y posiciones 0..5 hasta el cierre. (6) Marcha atrás en ORDEN: primero las puertas (un candado), después Pages.</w:t>
             </w:r>
           </w:p>
         </w:tc>

</xml_diff>